<commit_message>
Refresh astrology report color palette
</commit_message>
<xml_diff>
--- a/Tử vi Mr Hoàng/THANG-08-AM-BINH-NGO-2026.docx
+++ b/Tử vi Mr Hoàng/THANG-08-AM-BINH-NGO-2026.docx
@@ -11,7 +11,7 @@
         <w:rPr>
           <w:rFonts w:ascii="Aptos Display" w:hAnsi="Aptos Display"/>
           <w:b/>
-          <w:color w:val="17365D"/>
+          <w:color w:val="164E63"/>
           <w:sz w:val="44"/>
         </w:rPr>
         <w:t>TỬ VI THÁNG 08 ÂM LỊCH 2026</w:t>
@@ -23,7 +23,7 @@
       </w:pPr>
       <w:r>
         <w:rPr>
-          <w:color w:val="17365D"/>
+          <w:color w:val="164E63"/>
         </w:rPr>
         <w:t>Bản gửi Hoàng</w:t>
       </w:r>
@@ -134,7 +134,7 @@
       <w:pPr>
         <w:spacing w:after="160"/>
         <w:ind w:left="259" w:right="259"/>
-        <w:shd w:fill="FFF2CC"/>
+        <w:shd w:fill="FFF4D6"/>
       </w:pPr>
       <w:r>
         <w:rPr>
@@ -153,7 +153,7 @@
       <w:pPr>
         <w:spacing w:after="60"/>
         <w:pBdr>
-          <w:bottom w:val="single" w:sz="8" w:color="D9E2F3"/>
+          <w:bottom w:val="single" w:sz="8" w:color="D7C4A3"/>
         </w:pBdr>
       </w:pPr>
     </w:p>
@@ -163,7 +163,7 @@
       </w:pPr>
       <w:r>
         <w:rPr>
-          <w:color w:val="17365D"/>
+          <w:color w:val="164E63"/>
         </w:rPr>
         <w:t>1. Phạm vi và độ chính xác</w:t>
       </w:r>
@@ -196,7 +196,7 @@
       </w:pPr>
       <w:r>
         <w:rPr>
-          <w:color w:val="1F4E79"/>
+          <w:color w:val="0F766E"/>
         </w:rPr>
         <w:t>Quy ước dữ liệu đã chốt</w:t>
       </w:r>
@@ -253,7 +253,7 @@
       <w:pPr>
         <w:spacing w:after="60"/>
         <w:pBdr>
-          <w:bottom w:val="single" w:sz="8" w:color="D9E2F3"/>
+          <w:bottom w:val="single" w:sz="8" w:color="D7C4A3"/>
         </w:pBdr>
       </w:pPr>
     </w:p>
@@ -263,7 +263,7 @@
       </w:pPr>
       <w:r>
         <w:rPr>
-          <w:color w:val="17365D"/>
+          <w:color w:val="164E63"/>
         </w:rPr>
         <w:t>2. Cấu trúc tháng 8 âm</w:t>
       </w:r>
@@ -309,7 +309,7 @@
       </w:pPr>
       <w:r>
         <w:rPr>
-          <w:color w:val="216E39"/>
+          <w:color w:val="3F7D4A"/>
         </w:rPr>
         <w:t>Tài Bạch Dậu: cung bị kích hoạt trực tiếp</w:t>
       </w:r>
@@ -438,7 +438,7 @@
       </w:pPr>
       <w:r>
         <w:rPr>
-          <w:color w:val="216E39"/>
+          <w:color w:val="3F7D4A"/>
         </w:rPr>
         <w:t>Tam hợp Tỵ – Dậu – Sửu: Quan Lộc – Tài Bạch – Mệnh</w:t>
       </w:r>
@@ -546,7 +546,7 @@
       </w:pPr>
       <w:r>
         <w:rPr>
-          <w:color w:val="216E39"/>
+          <w:color w:val="3F7D4A"/>
         </w:rPr>
         <w:t>Đối cung Dậu – Mão: Tài Bạch xung Phúc Đức</w:t>
       </w:r>
@@ -568,7 +568,7 @@
       </w:pPr>
       <w:r>
         <w:rPr>
-          <w:color w:val="216E39"/>
+          <w:color w:val="3F7D4A"/>
         </w:rPr>
         <w:t>Lục hợp Dậu – Thìn: Tài Bạch hợp Điền Trạch</w:t>
       </w:r>
@@ -588,7 +588,7 @@
       <w:pPr>
         <w:spacing w:after="60"/>
         <w:pBdr>
-          <w:bottom w:val="single" w:sz="8" w:color="D9E2F3"/>
+          <w:bottom w:val="single" w:sz="8" w:color="D7C4A3"/>
         </w:pBdr>
       </w:pPr>
     </w:p>
@@ -598,7 +598,7 @@
       </w:pPr>
       <w:r>
         <w:rPr>
-          <w:color w:val="17365D"/>
+          <w:color w:val="164E63"/>
         </w:rPr>
         <w:t>3. Luận chi tiết 12 cung</w:t>
       </w:r>
@@ -609,7 +609,7 @@
       </w:pPr>
       <w:r>
         <w:rPr>
-          <w:color w:val="1F4E79"/>
+          <w:color w:val="0F766E"/>
         </w:rPr>
         <w:t>1. Mệnh – Sửu</w:t>
       </w:r>
@@ -693,7 +693,7 @@
       </w:pPr>
       <w:r>
         <w:rPr>
-          <w:color w:val="1F4E79"/>
+          <w:color w:val="0F766E"/>
         </w:rPr>
         <w:t>2. Quan Lộc – Tỵ</w:t>
       </w:r>
@@ -777,7 +777,7 @@
       </w:pPr>
       <w:r>
         <w:rPr>
-          <w:color w:val="216E39"/>
+          <w:color w:val="3F7D4A"/>
         </w:rPr>
         <w:t>3. Tài Bạch – Dậu</w:t>
       </w:r>
@@ -861,7 +861,7 @@
       </w:pPr>
       <w:r>
         <w:rPr>
-          <w:color w:val="1F4E79"/>
+          <w:color w:val="0F766E"/>
         </w:rPr>
         <w:t>4. Thiên Di – Mùi</w:t>
       </w:r>
@@ -911,7 +911,7 @@
       </w:pPr>
       <w:r>
         <w:rPr>
-          <w:color w:val="1F4E79"/>
+          <w:color w:val="0F766E"/>
         </w:rPr>
         <w:t>5. Phúc Đức – Mão</w:t>
       </w:r>
@@ -984,7 +984,7 @@
       </w:pPr>
       <w:r>
         <w:rPr>
-          <w:color w:val="1F4E79"/>
+          <w:color w:val="0F766E"/>
         </w:rPr>
         <w:t>6. Điền Trạch – Thìn</w:t>
       </w:r>
@@ -1057,7 +1057,7 @@
       </w:pPr>
       <w:r>
         <w:rPr>
-          <w:color w:val="1F4E79"/>
+          <w:color w:val="0F766E"/>
         </w:rPr>
         <w:t>7. Nô Bộc – Ngọ</w:t>
       </w:r>
@@ -1141,7 +1141,7 @@
       </w:pPr>
       <w:r>
         <w:rPr>
-          <w:color w:val="1F4E79"/>
+          <w:color w:val="0F766E"/>
         </w:rPr>
         <w:t>8. Tật Ách – Thân</w:t>
       </w:r>
@@ -1191,7 +1191,7 @@
       </w:pPr>
       <w:r>
         <w:rPr>
-          <w:color w:val="1F4E79"/>
+          <w:color w:val="0F766E"/>
         </w:rPr>
         <w:t>9. Tử Tức – Tuất</w:t>
       </w:r>
@@ -1264,7 +1264,7 @@
       </w:pPr>
       <w:r>
         <w:rPr>
-          <w:color w:val="1F4E79"/>
+          <w:color w:val="0F766E"/>
         </w:rPr>
         <w:t>10. Phu Thê – Hợi</w:t>
       </w:r>
@@ -1303,7 +1303,7 @@
       </w:pPr>
       <w:r>
         <w:rPr>
-          <w:color w:val="1F4E79"/>
+          <w:color w:val="0F766E"/>
         </w:rPr>
         <w:t>11. Phụ Mẫu – Dần</w:t>
       </w:r>
@@ -1342,7 +1342,7 @@
       </w:pPr>
       <w:r>
         <w:rPr>
-          <w:color w:val="1F4E79"/>
+          <w:color w:val="0F766E"/>
         </w:rPr>
         <w:t>12. Huynh Đệ – Tý</w:t>
       </w:r>
@@ -1379,7 +1379,7 @@
       <w:pPr>
         <w:spacing w:after="60"/>
         <w:pBdr>
-          <w:bottom w:val="single" w:sz="8" w:color="D9E2F3"/>
+          <w:bottom w:val="single" w:sz="8" w:color="D7C4A3"/>
         </w:pBdr>
       </w:pPr>
     </w:p>
@@ -1389,7 +1389,7 @@
       </w:pPr>
       <w:r>
         <w:rPr>
-          <w:color w:val="17365D"/>
+          <w:color w:val="164E63"/>
         </w:rPr>
         <w:t>4. Phân tích sâu theo chủ đề</w:t>
       </w:r>
@@ -1400,7 +1400,7 @@
       </w:pPr>
       <w:r>
         <w:rPr>
-          <w:color w:val="1F4E79"/>
+          <w:color w:val="0F766E"/>
         </w:rPr>
         <w:t>Mệnh và cách ra quyết định</w:t>
       </w:r>
@@ -1473,7 +1473,7 @@
       </w:pPr>
       <w:r>
         <w:rPr>
-          <w:color w:val="216E39"/>
+          <w:color w:val="3F7D4A"/>
         </w:rPr>
         <w:t>Tài Bạch và cơ hội kinh doanh</w:t>
       </w:r>
@@ -1546,7 +1546,7 @@
       </w:pPr>
       <w:r>
         <w:rPr>
-          <w:color w:val="1F4E79"/>
+          <w:color w:val="0F766E"/>
         </w:rPr>
         <w:t>Quan Lộc, danh tiếng và công việc</w:t>
       </w:r>
@@ -1619,7 +1619,7 @@
       </w:pPr>
       <w:r>
         <w:rPr>
-          <w:color w:val="1F4E79"/>
+          <w:color w:val="0F766E"/>
         </w:rPr>
         <w:t>Tật Ách và sức khỏe</w:t>
       </w:r>
@@ -1675,7 +1675,7 @@
       </w:pPr>
       <w:r>
         <w:rPr>
-          <w:color w:val="1F4E79"/>
+          <w:color w:val="0F766E"/>
         </w:rPr>
         <w:t>Gia đình, vợ và thê thiếp</w:t>
       </w:r>
@@ -1748,7 +1748,7 @@
       </w:pPr>
       <w:r>
         <w:rPr>
-          <w:color w:val="1F4E79"/>
+          <w:color w:val="0F766E"/>
         </w:rPr>
         <w:t>Con cái và kế hoạch dài hạn</w:t>
       </w:r>
@@ -1804,7 +1804,7 @@
       </w:pPr>
       <w:r>
         <w:rPr>
-          <w:color w:val="1F4E79"/>
+          <w:color w:val="0F766E"/>
         </w:rPr>
         <w:t>Anh chị em, bạn bè và Nô Bộc</w:t>
       </w:r>
@@ -1877,7 +1877,7 @@
       </w:pPr>
       <w:r>
         <w:rPr>
-          <w:color w:val="1F4E79"/>
+          <w:color w:val="0F766E"/>
         </w:rPr>
         <w:t>Bất động sản, mặt bằng và tài sản</w:t>
       </w:r>
@@ -1933,7 +1933,7 @@
       </w:pPr>
       <w:r>
         <w:rPr>
-          <w:color w:val="1F4E79"/>
+          <w:color w:val="0F766E"/>
         </w:rPr>
         <w:t>Ma trận rủi ro tháng</w:t>
       </w:r>
@@ -1956,7 +1956,7 @@
           <w:tcPr>
             <w:tcW w:type="dxa" w:w="2556"/>
             <w:vAlign w:val="center"/>
-            <w:shd w:fill="17365D"/>
+            <w:shd w:fill="164E63"/>
           </w:tcPr>
           <w:p>
             <w:pPr>
@@ -1977,7 +1977,7 @@
           <w:tcPr>
             <w:tcW w:type="dxa" w:w="2556"/>
             <w:vAlign w:val="center"/>
-            <w:shd w:fill="17365D"/>
+            <w:shd w:fill="164E63"/>
           </w:tcPr>
           <w:p>
             <w:pPr>
@@ -1998,7 +1998,7 @@
           <w:tcPr>
             <w:tcW w:type="dxa" w:w="2556"/>
             <w:vAlign w:val="center"/>
-            <w:shd w:fill="17365D"/>
+            <w:shd w:fill="164E63"/>
           </w:tcPr>
           <w:p>
             <w:pPr>
@@ -2019,7 +2019,7 @@
           <w:tcPr>
             <w:tcW w:type="dxa" w:w="2556"/>
             <w:vAlign w:val="center"/>
-            <w:shd w:fill="17365D"/>
+            <w:shd w:fill="164E63"/>
           </w:tcPr>
           <w:p>
             <w:pPr>
@@ -2515,7 +2515,7 @@
       <w:pPr>
         <w:spacing w:after="60"/>
         <w:pBdr>
-          <w:bottom w:val="single" w:sz="8" w:color="D9E2F3"/>
+          <w:bottom w:val="single" w:sz="8" w:color="D7C4A3"/>
         </w:pBdr>
       </w:pPr>
     </w:p>
@@ -2525,7 +2525,7 @@
       </w:pPr>
       <w:r>
         <w:rPr>
-          <w:color w:val="17365D"/>
+          <w:color w:val="164E63"/>
         </w:rPr>
         <w:t>5. Lịch từng ngày</w:t>
       </w:r>
@@ -2536,7 +2536,7 @@
       </w:pPr>
       <w:r>
         <w:rPr>
-          <w:color w:val="1F4E79"/>
+          <w:color w:val="0F766E"/>
         </w:rPr>
         <w:t>Cách đọc</w:t>
       </w:r>
@@ -2698,7 +2698,7 @@
           <w:tcPr>
             <w:tcW w:type="dxa" w:w="2045"/>
             <w:vAlign w:val="center"/>
-            <w:shd w:fill="17365D"/>
+            <w:shd w:fill="164E63"/>
           </w:tcPr>
           <w:p>
             <w:pPr>
@@ -2719,7 +2719,7 @@
           <w:tcPr>
             <w:tcW w:type="dxa" w:w="2045"/>
             <w:vAlign w:val="center"/>
-            <w:shd w:fill="17365D"/>
+            <w:shd w:fill="164E63"/>
           </w:tcPr>
           <w:p>
             <w:pPr>
@@ -2740,7 +2740,7 @@
           <w:tcPr>
             <w:tcW w:type="dxa" w:w="2045"/>
             <w:vAlign w:val="center"/>
-            <w:shd w:fill="17365D"/>
+            <w:shd w:fill="164E63"/>
           </w:tcPr>
           <w:p>
             <w:pPr>
@@ -2761,7 +2761,7 @@
           <w:tcPr>
             <w:tcW w:type="dxa" w:w="2045"/>
             <w:vAlign w:val="center"/>
-            <w:shd w:fill="17365D"/>
+            <w:shd w:fill="164E63"/>
           </w:tcPr>
           <w:p>
             <w:pPr>
@@ -2782,7 +2782,7 @@
           <w:tcPr>
             <w:tcW w:type="dxa" w:w="2045"/>
             <w:vAlign w:val="center"/>
-            <w:shd w:fill="17365D"/>
+            <w:shd w:fill="164E63"/>
           </w:tcPr>
           <w:p>
             <w:pPr>
@@ -2861,6 +2861,7 @@
         <w:tc>
           <w:tcPr>
             <w:tcW w:type="dxa" w:w="2045"/>
+            <w:shd w:fill="FFF4D6"/>
             <w:vAlign w:val="center"/>
           </w:tcPr>
           <w:p>
@@ -2871,6 +2872,7 @@
             <w:r>
               <w:rPr>
                 <w:b w:val="0"/>
+                <w:color w:val="B7791F"/>
                 <w:sz w:val="16"/>
               </w:rPr>
               <w:t>Tốt</w:t>
@@ -2958,7 +2960,7 @@
         <w:tc>
           <w:tcPr>
             <w:tcW w:type="dxa" w:w="2045"/>
-            <w:shd w:fill="FCE4D6"/>
+            <w:shd w:fill="FDE8E2"/>
             <w:vAlign w:val="center"/>
           </w:tcPr>
           <w:p>
@@ -2969,7 +2971,7 @@
             <w:r>
               <w:rPr>
                 <w:b w:val="0"/>
-                <w:color w:val="9C0006"/>
+                <w:color w:val="C2413B"/>
                 <w:sz w:val="16"/>
               </w:rPr>
               <w:t>Cẩn trọng</w:t>
@@ -3057,6 +3059,7 @@
         <w:tc>
           <w:tcPr>
             <w:tcW w:type="dxa" w:w="2045"/>
+            <w:shd w:fill="E5F3F1"/>
             <w:vAlign w:val="center"/>
           </w:tcPr>
           <w:p>
@@ -3067,6 +3070,7 @@
             <w:r>
               <w:rPr>
                 <w:b w:val="0"/>
+                <w:color w:val="0F766E"/>
                 <w:sz w:val="16"/>
               </w:rPr>
               <w:t>Khá</w:t>
@@ -3154,6 +3158,7 @@
         <w:tc>
           <w:tcPr>
             <w:tcW w:type="dxa" w:w="2045"/>
+            <w:shd w:fill="E5F3F1"/>
             <w:vAlign w:val="center"/>
           </w:tcPr>
           <w:p>
@@ -3164,6 +3169,7 @@
             <w:r>
               <w:rPr>
                 <w:b w:val="0"/>
+                <w:color w:val="0F766E"/>
                 <w:sz w:val="16"/>
               </w:rPr>
               <w:t>Khá</w:t>
@@ -3251,7 +3257,7 @@
         <w:tc>
           <w:tcPr>
             <w:tcW w:type="dxa" w:w="2045"/>
-            <w:shd w:fill="E2F0D9"/>
+            <w:shd w:fill="E7F3E5"/>
             <w:vAlign w:val="center"/>
           </w:tcPr>
           <w:p>
@@ -3262,7 +3268,7 @@
             <w:r>
               <w:rPr>
                 <w:b w:val="0"/>
-                <w:color w:val="216E39"/>
+                <w:color w:val="3F7D4A"/>
                 <w:sz w:val="16"/>
               </w:rPr>
               <w:t>Rất tốt</w:t>
@@ -3350,6 +3356,7 @@
         <w:tc>
           <w:tcPr>
             <w:tcW w:type="dxa" w:w="2045"/>
+            <w:shd w:fill="E5F3F1"/>
             <w:vAlign w:val="center"/>
           </w:tcPr>
           <w:p>
@@ -3360,6 +3367,7 @@
             <w:r>
               <w:rPr>
                 <w:b w:val="0"/>
+                <w:color w:val="0F766E"/>
                 <w:sz w:val="16"/>
               </w:rPr>
               <w:t>Khá</w:t>
@@ -3447,6 +3455,7 @@
         <w:tc>
           <w:tcPr>
             <w:tcW w:type="dxa" w:w="2045"/>
+            <w:shd w:fill="E5F3F1"/>
             <w:vAlign w:val="center"/>
           </w:tcPr>
           <w:p>
@@ -3457,6 +3466,7 @@
             <w:r>
               <w:rPr>
                 <w:b w:val="0"/>
+                <w:color w:val="0F766E"/>
                 <w:sz w:val="16"/>
               </w:rPr>
               <w:t>Khá</w:t>
@@ -3544,7 +3554,7 @@
         <w:tc>
           <w:tcPr>
             <w:tcW w:type="dxa" w:w="2045"/>
-            <w:shd w:fill="FCE4D6"/>
+            <w:shd w:fill="FDE8E2"/>
             <w:vAlign w:val="center"/>
           </w:tcPr>
           <w:p>
@@ -3555,7 +3565,7 @@
             <w:r>
               <w:rPr>
                 <w:b w:val="0"/>
-                <w:color w:val="9C0006"/>
+                <w:color w:val="C2413B"/>
                 <w:sz w:val="16"/>
               </w:rPr>
               <w:t>Cẩn trọng</w:t>
@@ -3643,6 +3653,7 @@
         <w:tc>
           <w:tcPr>
             <w:tcW w:type="dxa" w:w="2045"/>
+            <w:shd w:fill="FFF4D6"/>
             <w:vAlign w:val="center"/>
           </w:tcPr>
           <w:p>
@@ -3653,6 +3664,7 @@
             <w:r>
               <w:rPr>
                 <w:b w:val="0"/>
+                <w:color w:val="B7791F"/>
                 <w:sz w:val="16"/>
               </w:rPr>
               <w:t>Tốt</w:t>
@@ -3740,6 +3752,7 @@
         <w:tc>
           <w:tcPr>
             <w:tcW w:type="dxa" w:w="2045"/>
+            <w:shd w:fill="E5F3F1"/>
             <w:vAlign w:val="center"/>
           </w:tcPr>
           <w:p>
@@ -3750,6 +3763,7 @@
             <w:r>
               <w:rPr>
                 <w:b w:val="0"/>
+                <w:color w:val="0F766E"/>
                 <w:sz w:val="16"/>
               </w:rPr>
               <w:t>Khá</w:t>
@@ -3837,7 +3851,7 @@
         <w:tc>
           <w:tcPr>
             <w:tcW w:type="dxa" w:w="2045"/>
-            <w:shd w:fill="FCE4D6"/>
+            <w:shd w:fill="FDE8E2"/>
             <w:vAlign w:val="center"/>
           </w:tcPr>
           <w:p>
@@ -3848,7 +3862,7 @@
             <w:r>
               <w:rPr>
                 <w:b w:val="0"/>
-                <w:color w:val="9C0006"/>
+                <w:color w:val="C2413B"/>
                 <w:sz w:val="16"/>
               </w:rPr>
               <w:t>Cẩn trọng</w:t>
@@ -3936,6 +3950,7 @@
         <w:tc>
           <w:tcPr>
             <w:tcW w:type="dxa" w:w="2045"/>
+            <w:shd w:fill="FFF4D6"/>
             <w:vAlign w:val="center"/>
           </w:tcPr>
           <w:p>
@@ -3946,6 +3961,7 @@
             <w:r>
               <w:rPr>
                 <w:b w:val="0"/>
+                <w:color w:val="B7791F"/>
                 <w:sz w:val="16"/>
               </w:rPr>
               <w:t>Tốt</w:t>
@@ -4033,6 +4049,7 @@
         <w:tc>
           <w:tcPr>
             <w:tcW w:type="dxa" w:w="2045"/>
+            <w:shd w:fill="FFF4D6"/>
             <w:vAlign w:val="center"/>
           </w:tcPr>
           <w:p>
@@ -4043,6 +4060,7 @@
             <w:r>
               <w:rPr>
                 <w:b w:val="0"/>
+                <w:color w:val="B7791F"/>
                 <w:sz w:val="16"/>
               </w:rPr>
               <w:t>Tốt</w:t>
@@ -4130,7 +4148,7 @@
         <w:tc>
           <w:tcPr>
             <w:tcW w:type="dxa" w:w="2045"/>
-            <w:shd w:fill="FCE4D6"/>
+            <w:shd w:fill="FDE8E2"/>
             <w:vAlign w:val="center"/>
           </w:tcPr>
           <w:p>
@@ -4141,7 +4159,7 @@
             <w:r>
               <w:rPr>
                 <w:b w:val="0"/>
-                <w:color w:val="9C0006"/>
+                <w:color w:val="C2413B"/>
                 <w:sz w:val="16"/>
               </w:rPr>
               <w:t>Cẩn trọng</w:t>
@@ -4229,6 +4247,7 @@
         <w:tc>
           <w:tcPr>
             <w:tcW w:type="dxa" w:w="2045"/>
+            <w:shd w:fill="E5F3F1"/>
             <w:vAlign w:val="center"/>
           </w:tcPr>
           <w:p>
@@ -4239,6 +4258,7 @@
             <w:r>
               <w:rPr>
                 <w:b w:val="0"/>
+                <w:color w:val="0F766E"/>
                 <w:sz w:val="16"/>
               </w:rPr>
               <w:t>Khá</w:t>
@@ -4326,6 +4346,7 @@
         <w:tc>
           <w:tcPr>
             <w:tcW w:type="dxa" w:w="2045"/>
+            <w:shd w:fill="E5F3F1"/>
             <w:vAlign w:val="center"/>
           </w:tcPr>
           <w:p>
@@ -4336,6 +4357,7 @@
             <w:r>
               <w:rPr>
                 <w:b w:val="0"/>
+                <w:color w:val="0F766E"/>
                 <w:sz w:val="16"/>
               </w:rPr>
               <w:t>Khá</w:t>
@@ -4423,7 +4445,7 @@
         <w:tc>
           <w:tcPr>
             <w:tcW w:type="dxa" w:w="2045"/>
-            <w:shd w:fill="E2F0D9"/>
+            <w:shd w:fill="E7F3E5"/>
             <w:vAlign w:val="center"/>
           </w:tcPr>
           <w:p>
@@ -4434,7 +4456,7 @@
             <w:r>
               <w:rPr>
                 <w:b w:val="0"/>
-                <w:color w:val="216E39"/>
+                <w:color w:val="3F7D4A"/>
                 <w:sz w:val="16"/>
               </w:rPr>
               <w:t>Rất tốt</w:t>
@@ -4522,6 +4544,7 @@
         <w:tc>
           <w:tcPr>
             <w:tcW w:type="dxa" w:w="2045"/>
+            <w:shd w:fill="E5F3F1"/>
             <w:vAlign w:val="center"/>
           </w:tcPr>
           <w:p>
@@ -4532,6 +4555,7 @@
             <w:r>
               <w:rPr>
                 <w:b w:val="0"/>
+                <w:color w:val="0F766E"/>
                 <w:sz w:val="16"/>
               </w:rPr>
               <w:t>Khá</w:t>
@@ -4619,6 +4643,7 @@
         <w:tc>
           <w:tcPr>
             <w:tcW w:type="dxa" w:w="2045"/>
+            <w:shd w:fill="E5F3F1"/>
             <w:vAlign w:val="center"/>
           </w:tcPr>
           <w:p>
@@ -4629,6 +4654,7 @@
             <w:r>
               <w:rPr>
                 <w:b w:val="0"/>
+                <w:color w:val="0F766E"/>
                 <w:sz w:val="16"/>
               </w:rPr>
               <w:t>Khá</w:t>
@@ -4716,7 +4742,7 @@
         <w:tc>
           <w:tcPr>
             <w:tcW w:type="dxa" w:w="2045"/>
-            <w:shd w:fill="FCE4D6"/>
+            <w:shd w:fill="FDE8E2"/>
             <w:vAlign w:val="center"/>
           </w:tcPr>
           <w:p>
@@ -4727,7 +4753,7 @@
             <w:r>
               <w:rPr>
                 <w:b w:val="0"/>
-                <w:color w:val="9C0006"/>
+                <w:color w:val="C2413B"/>
                 <w:sz w:val="16"/>
               </w:rPr>
               <w:t>Cẩn trọng</w:t>
@@ -4815,6 +4841,7 @@
         <w:tc>
           <w:tcPr>
             <w:tcW w:type="dxa" w:w="2045"/>
+            <w:shd w:fill="FFF4D6"/>
             <w:vAlign w:val="center"/>
           </w:tcPr>
           <w:p>
@@ -4825,6 +4852,7 @@
             <w:r>
               <w:rPr>
                 <w:b w:val="0"/>
+                <w:color w:val="B7791F"/>
                 <w:sz w:val="16"/>
               </w:rPr>
               <w:t>Tốt</w:t>
@@ -4912,6 +4940,7 @@
         <w:tc>
           <w:tcPr>
             <w:tcW w:type="dxa" w:w="2045"/>
+            <w:shd w:fill="E5F3F1"/>
             <w:vAlign w:val="center"/>
           </w:tcPr>
           <w:p>
@@ -4922,6 +4951,7 @@
             <w:r>
               <w:rPr>
                 <w:b w:val="0"/>
+                <w:color w:val="0F766E"/>
                 <w:sz w:val="16"/>
               </w:rPr>
               <w:t>Khá</w:t>
@@ -5009,7 +5039,7 @@
         <w:tc>
           <w:tcPr>
             <w:tcW w:type="dxa" w:w="2045"/>
-            <w:shd w:fill="FCE4D6"/>
+            <w:shd w:fill="FDE8E2"/>
             <w:vAlign w:val="center"/>
           </w:tcPr>
           <w:p>
@@ -5020,7 +5050,7 @@
             <w:r>
               <w:rPr>
                 <w:b w:val="0"/>
-                <w:color w:val="9C0006"/>
+                <w:color w:val="C2413B"/>
                 <w:sz w:val="16"/>
               </w:rPr>
               <w:t>Cẩn trọng</w:t>
@@ -5108,6 +5138,7 @@
         <w:tc>
           <w:tcPr>
             <w:tcW w:type="dxa" w:w="2045"/>
+            <w:shd w:fill="FFF4D6"/>
             <w:vAlign w:val="center"/>
           </w:tcPr>
           <w:p>
@@ -5118,6 +5149,7 @@
             <w:r>
               <w:rPr>
                 <w:b w:val="0"/>
+                <w:color w:val="B7791F"/>
                 <w:sz w:val="16"/>
               </w:rPr>
               <w:t>Tốt</w:t>
@@ -5205,6 +5237,7 @@
         <w:tc>
           <w:tcPr>
             <w:tcW w:type="dxa" w:w="2045"/>
+            <w:shd w:fill="FFF4D6"/>
             <w:vAlign w:val="center"/>
           </w:tcPr>
           <w:p>
@@ -5215,6 +5248,7 @@
             <w:r>
               <w:rPr>
                 <w:b w:val="0"/>
+                <w:color w:val="B7791F"/>
                 <w:sz w:val="16"/>
               </w:rPr>
               <w:t>Tốt</w:t>
@@ -5302,7 +5336,7 @@
         <w:tc>
           <w:tcPr>
             <w:tcW w:type="dxa" w:w="2045"/>
-            <w:shd w:fill="FCE4D6"/>
+            <w:shd w:fill="FDE8E2"/>
             <w:vAlign w:val="center"/>
           </w:tcPr>
           <w:p>
@@ -5313,7 +5347,7 @@
             <w:r>
               <w:rPr>
                 <w:b w:val="0"/>
-                <w:color w:val="9C0006"/>
+                <w:color w:val="C2413B"/>
                 <w:sz w:val="16"/>
               </w:rPr>
               <w:t>Cẩn trọng</w:t>
@@ -5401,6 +5435,7 @@
         <w:tc>
           <w:tcPr>
             <w:tcW w:type="dxa" w:w="2045"/>
+            <w:shd w:fill="E5F3F1"/>
             <w:vAlign w:val="center"/>
           </w:tcPr>
           <w:p>
@@ -5411,6 +5446,7 @@
             <w:r>
               <w:rPr>
                 <w:b w:val="0"/>
+                <w:color w:val="0F766E"/>
                 <w:sz w:val="16"/>
               </w:rPr>
               <w:t>Khá</w:t>
@@ -5498,6 +5534,7 @@
         <w:tc>
           <w:tcPr>
             <w:tcW w:type="dxa" w:w="2045"/>
+            <w:shd w:fill="E5F3F1"/>
             <w:vAlign w:val="center"/>
           </w:tcPr>
           <w:p>
@@ -5508,6 +5545,7 @@
             <w:r>
               <w:rPr>
                 <w:b w:val="0"/>
+                <w:color w:val="0F766E"/>
                 <w:sz w:val="16"/>
               </w:rPr>
               <w:t>Khá</w:t>
@@ -5595,7 +5633,7 @@
         <w:tc>
           <w:tcPr>
             <w:tcW w:type="dxa" w:w="2045"/>
-            <w:shd w:fill="E2F0D9"/>
+            <w:shd w:fill="E7F3E5"/>
             <w:vAlign w:val="center"/>
           </w:tcPr>
           <w:p>
@@ -5606,7 +5644,7 @@
             <w:r>
               <w:rPr>
                 <w:b w:val="0"/>
-                <w:color w:val="216E39"/>
+                <w:color w:val="3F7D4A"/>
                 <w:sz w:val="16"/>
               </w:rPr>
               <w:t>Rất tốt</w:t>
@@ -5694,6 +5732,7 @@
         <w:tc>
           <w:tcPr>
             <w:tcW w:type="dxa" w:w="2045"/>
+            <w:shd w:fill="E5F3F1"/>
             <w:vAlign w:val="center"/>
           </w:tcPr>
           <w:p>
@@ -5704,6 +5743,7 @@
             <w:r>
               <w:rPr>
                 <w:b w:val="0"/>
+                <w:color w:val="0F766E"/>
                 <w:sz w:val="16"/>
               </w:rPr>
               <w:t>Khá</w:t>
@@ -5740,7 +5780,7 @@
       <w:pPr>
         <w:spacing w:after="60"/>
         <w:pBdr>
-          <w:bottom w:val="single" w:sz="8" w:color="D9E2F3"/>
+          <w:bottom w:val="single" w:sz="8" w:color="D7C4A3"/>
         </w:pBdr>
       </w:pPr>
     </w:p>
@@ -5750,7 +5790,7 @@
       </w:pPr>
       <w:r>
         <w:rPr>
-          <w:color w:val="17365D"/>
+          <w:color w:val="164E63"/>
         </w:rPr>
         <w:t>6. Các ngày nổi bật</w:t>
       </w:r>
@@ -5761,7 +5801,7 @@
       </w:pPr>
       <w:r>
         <w:rPr>
-          <w:color w:val="1F4E79"/>
+          <w:color w:val="0F766E"/>
         </w:rPr>
         <w:t>Nhóm nên ưu tiên việc tiền và công việc</w:t>
       </w:r>
@@ -5789,7 +5829,7 @@
       </w:pPr>
       <w:r>
         <w:rPr>
-          <w:color w:val="1F4E79"/>
+          <w:color w:val="0F766E"/>
         </w:rPr>
         <w:t>Nhóm cần giữ người và giữ lời</w:t>
       </w:r>
@@ -5817,7 +5857,7 @@
       </w:pPr>
       <w:r>
         <w:rPr>
-          <w:color w:val="1F4E79"/>
+          <w:color w:val="0F766E"/>
         </w:rPr>
         <w:t>Nhóm nên hoãn quyết định tài chính mạo hiểm</w:t>
       </w:r>
@@ -5843,7 +5883,7 @@
       <w:pPr>
         <w:spacing w:after="60"/>
         <w:pBdr>
-          <w:bottom w:val="single" w:sz="8" w:color="D9E2F3"/>
+          <w:bottom w:val="single" w:sz="8" w:color="D7C4A3"/>
         </w:pBdr>
       </w:pPr>
     </w:p>
@@ -5853,7 +5893,7 @@
       </w:pPr>
       <w:r>
         <w:rPr>
-          <w:color w:val="17365D"/>
+          <w:color w:val="164E63"/>
         </w:rPr>
         <w:t>7. Kế hoạch hành động đề xuất</w:t>
       </w:r>
@@ -5864,7 +5904,7 @@
       </w:pPr>
       <w:r>
         <w:rPr>
-          <w:color w:val="1F4E79"/>
+          <w:color w:val="0F766E"/>
         </w:rPr>
         <w:t>Trước 11/09</w:t>
       </w:r>
@@ -5911,7 +5951,7 @@
       </w:pPr>
       <w:r>
         <w:rPr>
-          <w:color w:val="1F4E79"/>
+          <w:color w:val="0F766E"/>
         </w:rPr>
         <w:t>Trong tháng</w:t>
       </w:r>
@@ -5970,7 +6010,7 @@
       </w:pPr>
       <w:r>
         <w:rPr>
-          <w:color w:val="1F4E79"/>
+          <w:color w:val="0F766E"/>
         </w:rPr>
         <w:t>Cuối tháng</w:t>
       </w:r>
@@ -6027,7 +6067,7 @@
       <w:pPr>
         <w:spacing w:after="60"/>
         <w:pBdr>
-          <w:bottom w:val="single" w:sz="8" w:color="D9E2F3"/>
+          <w:bottom w:val="single" w:sz="8" w:color="D7C4A3"/>
         </w:pBdr>
       </w:pPr>
     </w:p>
@@ -6037,7 +6077,7 @@
       </w:pPr>
       <w:r>
         <w:rPr>
-          <w:color w:val="9C0006"/>
+          <w:color w:val="C2413B"/>
         </w:rPr>
         <w:t>Kết luận gửi Hoàng</w:t>
       </w:r>
@@ -6533,7 +6573,7 @@
       <w:rFonts w:asciiTheme="majorHAnsi" w:eastAsiaTheme="majorEastAsia" w:hAnsiTheme="majorHAnsi" w:cstheme="majorBidi" w:ascii="Aptos Display" w:hAnsi="Aptos Display" w:eastAsia="Aptos Display"/>
       <w:b/>
       <w:bCs/>
-      <w:color w:val="17365D"/>
+      <w:color w:val="164E63"/>
       <w:sz w:val="36"/>
       <w:szCs w:val="28"/>
     </w:rPr>
@@ -6557,7 +6597,7 @@
       <w:rFonts w:asciiTheme="majorHAnsi" w:eastAsiaTheme="majorEastAsia" w:hAnsiTheme="majorHAnsi" w:cstheme="majorBidi" w:ascii="Aptos Display" w:hAnsi="Aptos Display" w:eastAsia="Aptos Display"/>
       <w:b/>
       <w:bCs/>
-      <w:color w:val="1F4E79"/>
+      <w:color w:val="0F766E"/>
       <w:sz w:val="28"/>
       <w:szCs w:val="26"/>
     </w:rPr>
@@ -6581,7 +6621,7 @@
       <w:rFonts w:asciiTheme="majorHAnsi" w:eastAsiaTheme="majorEastAsia" w:hAnsiTheme="majorHAnsi" w:cstheme="majorBidi" w:ascii="Aptos Display" w:hAnsi="Aptos Display" w:eastAsia="Aptos Display"/>
       <w:b/>
       <w:bCs/>
-      <w:color w:val="1F4E79"/>
+      <w:color w:val="0F766E"/>
       <w:sz w:val="22"/>
     </w:rPr>
   </w:style>

</xml_diff>